<commit_message>
chore: update resume document with latest information
</commit_message>
<xml_diff>
--- a/public/resume/resume.docx
+++ b/public/resume/resume.docx
@@ -12,7 +12,6 @@
           <w:b/>
           <w:i w:val="0"/>
           <w:sz w:val="44"/>
-          <w:u w:val="none"/>
         </w:rPr>
         <w:t>Aliasgar A. Sogiawala</w:t>
       </w:r>
@@ -28,7 +27,6 @@
           <w:i w:val="0"/>
           <w:color w:val="444444"/>
           <w:sz w:val="22"/>
-          <w:u w:val="none"/>
         </w:rPr>
         <w:t>Full-Stack Developer  ·  AI/ML Enthusiast</w:t>
       </w:r>
@@ -44,7 +42,6 @@
           <w:i w:val="0"/>
           <w:color w:val="444444"/>
           <w:sz w:val="17"/>
-          <w:u w:val="none"/>
         </w:rPr>
         <w:t xml:space="preserve">1× Hackathon Winner  |  itsaliasgar18@gmail.com  |  +91 75068 78510  |  </w:t>
       </w:r>
@@ -54,7 +51,6 @@
           <w:i w:val="0"/>
           <w:color w:val="1A56DB"/>
           <w:sz w:val="17"/>
-          <w:u w:val="none"/>
         </w:rPr>
         <w:t>LinkedIn: linkedin.com/in/aliasgar-sogiawala</w:t>
       </w:r>
@@ -70,7 +66,6 @@
           <w:i w:val="0"/>
           <w:color w:val="1A56DB"/>
           <w:sz w:val="17"/>
-          <w:u w:val="none"/>
         </w:rPr>
         <w:t>GitHub: github.com/aliasgarsogiawala</w:t>
       </w:r>
@@ -80,7 +75,6 @@
           <w:i w:val="0"/>
           <w:color w:val="444444"/>
           <w:sz w:val="17"/>
-          <w:u w:val="none"/>
         </w:rPr>
         <w:t xml:space="preserve">  |  </w:t>
       </w:r>
@@ -90,7 +84,6 @@
           <w:i w:val="0"/>
           <w:color w:val="1A56DB"/>
           <w:sz w:val="17"/>
-          <w:u w:val="none"/>
         </w:rPr>
         <w:t>Portfolio: aliasgar-vscode.vercel.app</w:t>
       </w:r>
@@ -108,16 +101,12 @@
           <w:i w:val="0"/>
           <w:caps/>
           <w:sz w:val="19"/>
-          <w:u w:val="none"/>
         </w:rPr>
         <w:t>Education</w:t>
       </w:r>
     </w:p>
     <w:p>
       <w:pPr>
-        <w:tabs>
-          <w:tab w:pos="8640" w:val="right"/>
-        </w:tabs>
         <w:spacing w:before="100" w:after="20"/>
         <w:tabs>
           <w:tab w:val="right" w:pos="8640"/>
@@ -128,7 +117,6 @@
           <w:b/>
           <w:i w:val="0"/>
           <w:sz w:val="20"/>
-          <w:u w:val="none"/>
         </w:rPr>
         <w:t>Jai Hind College</w:t>
       </w:r>
@@ -140,7 +128,6 @@
           <w:b/>
           <w:i/>
           <w:sz w:val="19"/>
-          <w:u w:val="none"/>
         </w:rPr>
         <w:t>Graduation: March 2026</w:t>
       </w:r>
@@ -155,7 +142,6 @@
           <w:i/>
           <w:color w:val="444444"/>
           <w:sz w:val="19"/>
-          <w:u w:val="none"/>
         </w:rPr>
         <w:t>B.Sc. Information Technology  ·  GPA: 9.5/9.8</w:t>
       </w:r>
@@ -171,16 +157,12 @@
           <w:b w:val="0"/>
           <w:i w:val="0"/>
           <w:sz w:val="19"/>
-          <w:u w:val="none"/>
         </w:rPr>
         <w:t>Relevant Coursework: Data Structures, DBMS, Operating Systems, Computer Networks, Software Engineering, AI &amp; Machine Learning, Web Technologies, Cloud Computing</w:t>
       </w:r>
     </w:p>
     <w:p>
       <w:pPr>
-        <w:tabs>
-          <w:tab w:pos="8640" w:val="right"/>
-        </w:tabs>
         <w:spacing w:before="100" w:after="20"/>
         <w:tabs>
           <w:tab w:val="right" w:pos="8640"/>
@@ -191,7 +173,6 @@
           <w:b/>
           <w:i w:val="0"/>
           <w:sz w:val="20"/>
-          <w:u w:val="none"/>
         </w:rPr>
         <w:t>St. Xavier's College</w:t>
       </w:r>
@@ -203,7 +184,6 @@
           <w:b/>
           <w:i/>
           <w:sz w:val="19"/>
-          <w:u w:val="none"/>
         </w:rPr>
         <w:t>May 2023</w:t>
       </w:r>
@@ -218,16 +198,12 @@
           <w:i/>
           <w:color w:val="444444"/>
           <w:sz w:val="19"/>
-          <w:u w:val="none"/>
         </w:rPr>
         <w:t>FY &amp; SY Junior College, Science  ·  73%</w:t>
       </w:r>
     </w:p>
     <w:p>
       <w:pPr>
-        <w:tabs>
-          <w:tab w:pos="8640" w:val="right"/>
-        </w:tabs>
         <w:spacing w:before="100" w:after="20"/>
         <w:tabs>
           <w:tab w:val="right" w:pos="8640"/>
@@ -238,7 +214,6 @@
           <w:b/>
           <w:i w:val="0"/>
           <w:sz w:val="20"/>
-          <w:u w:val="none"/>
         </w:rPr>
         <w:t>Diamond Jubilee High School</w:t>
       </w:r>
@@ -250,7 +225,6 @@
           <w:b/>
           <w:i/>
           <w:sz w:val="19"/>
-          <w:u w:val="none"/>
         </w:rPr>
         <w:t>May 2021</w:t>
       </w:r>
@@ -265,7 +239,6 @@
           <w:i/>
           <w:color w:val="444444"/>
           <w:sz w:val="19"/>
-          <w:u w:val="none"/>
         </w:rPr>
         <w:t>Middle School  ·  97%</w:t>
       </w:r>
@@ -283,16 +256,12 @@
           <w:i w:val="0"/>
           <w:caps/>
           <w:sz w:val="19"/>
-          <w:u w:val="none"/>
         </w:rPr>
         <w:t>Projects / My Work</w:t>
       </w:r>
     </w:p>
     <w:p>
       <w:pPr>
-        <w:tabs>
-          <w:tab w:pos="8640" w:val="right"/>
-        </w:tabs>
         <w:spacing w:before="100" w:after="20"/>
         <w:tabs>
           <w:tab w:val="right" w:pos="8640"/>
@@ -303,7 +272,6 @@
           <w:b/>
           <w:i w:val="0"/>
           <w:sz w:val="20"/>
-          <w:u w:val="none"/>
         </w:rPr>
         <w:t>Eggstinction</w:t>
       </w:r>
@@ -313,7 +281,6 @@
           <w:i w:val="0"/>
           <w:color w:val="444444"/>
           <w:sz w:val="20"/>
-          <w:u w:val="none"/>
         </w:rPr>
         <w:t xml:space="preserve">  ·  </w:t>
       </w:r>
@@ -323,7 +290,6 @@
           <w:i/>
           <w:color w:val="444444"/>
           <w:sz w:val="20"/>
-          <w:u w:val="none"/>
         </w:rPr>
         <w:t>Solo Developer</w:t>
       </w:r>
@@ -335,7 +301,6 @@
           <w:b/>
           <w:i/>
           <w:sz w:val="19"/>
-          <w:u w:val="none"/>
         </w:rPr>
         <w:t>June 2026</w:t>
       </w:r>
@@ -351,14 +316,13 @@
           <w:b w:val="0"/>
           <w:i w:val="0"/>
           <w:sz w:val="19"/>
-          <w:u w:val="none"/>
         </w:rPr>
         <w:t>A canvas-based tower-defense game: defend the last dinosaur egg from a swarm of predators, with a gacha roulette that decides what your dinosaur becomes. Built with JavaScript, Canvas, and Convex.</w:t>
       </w:r>
     </w:p>
     <w:p>
       <w:pPr>
-        <w:spacing w:before="20" w:after="60"/>
+        <w:spacing w:before="20" w:after="40"/>
       </w:pPr>
       <w:r>
         <w:rPr>
@@ -366,16 +330,12 @@
           <w:i w:val="0"/>
           <w:color w:val="1A56DB"/>
           <w:sz w:val="18"/>
-          <w:u w:val="none"/>
         </w:rPr>
         <w:t>savedategg.vercel.app</w:t>
       </w:r>
     </w:p>
     <w:p>
       <w:pPr>
-        <w:tabs>
-          <w:tab w:pos="8640" w:val="right"/>
-        </w:tabs>
         <w:spacing w:before="100" w:after="20"/>
         <w:tabs>
           <w:tab w:val="right" w:pos="8640"/>
@@ -386,7 +346,6 @@
           <w:b/>
           <w:i w:val="0"/>
           <w:sz w:val="20"/>
-          <w:u w:val="none"/>
         </w:rPr>
         <w:t>storemyapi</w:t>
       </w:r>
@@ -396,7 +355,6 @@
           <w:i w:val="0"/>
           <w:color w:val="444444"/>
           <w:sz w:val="20"/>
-          <w:u w:val="none"/>
         </w:rPr>
         <w:t xml:space="preserve">  ·  </w:t>
       </w:r>
@@ -406,7 +364,6 @@
           <w:i/>
           <w:color w:val="444444"/>
           <w:sz w:val="20"/>
-          <w:u w:val="none"/>
         </w:rPr>
         <w:t>Solo Developer</w:t>
       </w:r>
@@ -418,7 +375,6 @@
           <w:b/>
           <w:i/>
           <w:sz w:val="19"/>
-          <w:u w:val="none"/>
         </w:rPr>
         <w:t>February 2026</w:t>
       </w:r>
@@ -434,14 +390,13 @@
           <w:b w:val="0"/>
           <w:i w:val="0"/>
           <w:sz w:val="19"/>
-          <w:u w:val="none"/>
         </w:rPr>
         <w:t>Built and published storemyapi: an npm CLI paired with a companion web dashboard for securely encrypting, storing, and syncing API keys and .env secrets to the cloud, with team sharing (read/write roles) and one-command Vercel deploys.</w:t>
       </w:r>
     </w:p>
     <w:p>
       <w:pPr>
-        <w:spacing w:before="20" w:after="60"/>
+        <w:spacing w:before="20" w:after="40"/>
       </w:pPr>
       <w:r>
         <w:rPr>
@@ -449,16 +404,26 @@
           <w:i w:val="0"/>
           <w:color w:val="1A56DB"/>
           <w:sz w:val="18"/>
-          <w:u w:val="none"/>
+        </w:rPr>
+        <w:t>storemyapi.dev</w:t>
+      </w:r>
+    </w:p>
+    <w:p>
+      <w:pPr>
+        <w:spacing w:before="20" w:after="40"/>
+      </w:pPr>
+      <w:r>
+        <w:rPr>
+          <w:b w:val="0"/>
+          <w:i w:val="0"/>
+          <w:color w:val="1A56DB"/>
+          <w:sz w:val="18"/>
         </w:rPr>
         <w:t>npmjs.com/package/storemyapi</w:t>
       </w:r>
     </w:p>
     <w:p>
       <w:pPr>
-        <w:tabs>
-          <w:tab w:pos="8640" w:val="right"/>
-        </w:tabs>
         <w:spacing w:before="100" w:after="20"/>
         <w:tabs>
           <w:tab w:val="right" w:pos="8640"/>
@@ -469,7 +434,6 @@
           <w:b/>
           <w:i w:val="0"/>
           <w:sz w:val="20"/>
-          <w:u w:val="none"/>
         </w:rPr>
         <w:t>TaskNet AI</w:t>
       </w:r>
@@ -479,7 +443,6 @@
           <w:i w:val="0"/>
           <w:color w:val="444444"/>
           <w:sz w:val="20"/>
-          <w:u w:val="none"/>
         </w:rPr>
         <w:t xml:space="preserve">  ·  </w:t>
       </w:r>
@@ -489,7 +452,6 @@
           <w:i/>
           <w:color w:val="444444"/>
           <w:sz w:val="20"/>
-          <w:u w:val="none"/>
         </w:rPr>
         <w:t>Solo Developer</w:t>
       </w:r>
@@ -501,7 +463,6 @@
           <w:b/>
           <w:i/>
           <w:sz w:val="19"/>
-          <w:u w:val="none"/>
         </w:rPr>
         <w:t>August 2025</w:t>
       </w:r>
@@ -518,7 +479,6 @@
           <w:i w:val="0"/>
           <w:color w:val="0E7490"/>
           <w:sz w:val="19"/>
-          <w:u w:val="none"/>
         </w:rPr>
         <w:t>AI</w:t>
       </w:r>
@@ -527,7 +487,6 @@
           <w:b w:val="0"/>
           <w:i w:val="0"/>
           <w:sz w:val="19"/>
-          <w:u w:val="none"/>
         </w:rPr>
         <w:t xml:space="preserve">-powered task-management app inspired by Todoist: uses the OpenAI API for smart task suggestions and Convex for real-time </w:t>
       </w:r>
@@ -537,7 +496,6 @@
           <w:i w:val="0"/>
           <w:color w:val="0E7490"/>
           <w:sz w:val="19"/>
-          <w:u w:val="none"/>
         </w:rPr>
         <w:t>semantic vector search</w:t>
       </w:r>
@@ -546,14 +504,13 @@
           <w:b w:val="0"/>
           <w:i w:val="0"/>
           <w:sz w:val="19"/>
-          <w:u w:val="none"/>
         </w:rPr>
         <w:t xml:space="preserve"> over to-dos. Built with Next.js, TypeScript, and shadcn/ui.</w:t>
       </w:r>
     </w:p>
     <w:p>
       <w:pPr>
-        <w:spacing w:before="20" w:after="60"/>
+        <w:spacing w:before="20" w:after="40"/>
       </w:pPr>
       <w:r>
         <w:rPr>
@@ -561,16 +518,12 @@
           <w:i w:val="0"/>
           <w:color w:val="1A56DB"/>
           <w:sz w:val="18"/>
-          <w:u w:val="none"/>
         </w:rPr>
         <w:t>tasknet-ai.vercel.app</w:t>
       </w:r>
     </w:p>
     <w:p>
       <w:pPr>
-        <w:tabs>
-          <w:tab w:pos="8640" w:val="right"/>
-        </w:tabs>
         <w:spacing w:before="100" w:after="20"/>
         <w:tabs>
           <w:tab w:val="right" w:pos="8640"/>
@@ -581,7 +534,6 @@
           <w:b/>
           <w:i w:val="0"/>
           <w:sz w:val="20"/>
-          <w:u w:val="none"/>
         </w:rPr>
         <w:t>ParaDoc</w:t>
       </w:r>
@@ -591,7 +543,6 @@
           <w:i w:val="0"/>
           <w:color w:val="444444"/>
           <w:sz w:val="20"/>
-          <w:u w:val="none"/>
         </w:rPr>
         <w:t xml:space="preserve">  ·  </w:t>
       </w:r>
@@ -601,7 +552,6 @@
           <w:i/>
           <w:color w:val="444444"/>
           <w:sz w:val="20"/>
-          <w:u w:val="none"/>
         </w:rPr>
         <w:t>Co-Developer</w:t>
       </w:r>
@@ -613,7 +563,6 @@
           <w:b/>
           <w:i/>
           <w:sz w:val="19"/>
-          <w:u w:val="none"/>
         </w:rPr>
         <w:t>May 2025</w:t>
       </w:r>
@@ -629,14 +578,13 @@
           <w:b w:val="0"/>
           <w:i w:val="0"/>
           <w:sz w:val="19"/>
-          <w:u w:val="none"/>
         </w:rPr>
         <w:t>A parallel-reality simulation for medical decision-making, built with Next.js, the Gemini API, and Clerk. Won 1st place at a hackathon.</w:t>
       </w:r>
     </w:p>
     <w:p>
       <w:pPr>
-        <w:spacing w:before="20" w:after="60"/>
+        <w:spacing w:before="20" w:after="40"/>
       </w:pPr>
       <w:r>
         <w:rPr>
@@ -644,16 +592,12 @@
           <w:i w:val="0"/>
           <w:color w:val="1A56DB"/>
           <w:sz w:val="18"/>
-          <w:u w:val="none"/>
         </w:rPr>
         <w:t>paradocc.vercel.app</w:t>
       </w:r>
     </w:p>
     <w:p>
       <w:pPr>
-        <w:tabs>
-          <w:tab w:pos="8640" w:val="right"/>
-        </w:tabs>
         <w:spacing w:before="100" w:after="20"/>
         <w:tabs>
           <w:tab w:val="right" w:pos="8640"/>
@@ -664,7 +608,6 @@
           <w:b/>
           <w:i w:val="0"/>
           <w:sz w:val="20"/>
-          <w:u w:val="none"/>
         </w:rPr>
         <w:t>FakeGeotag</w:t>
       </w:r>
@@ -674,7 +617,6 @@
           <w:i w:val="0"/>
           <w:color w:val="444444"/>
           <w:sz w:val="20"/>
-          <w:u w:val="none"/>
         </w:rPr>
         <w:t xml:space="preserve">  ·  </w:t>
       </w:r>
@@ -684,7 +626,6 @@
           <w:i/>
           <w:color w:val="444444"/>
           <w:sz w:val="20"/>
-          <w:u w:val="none"/>
         </w:rPr>
         <w:t>Solo Developer</w:t>
       </w:r>
@@ -696,7 +637,6 @@
           <w:b/>
           <w:i/>
           <w:sz w:val="19"/>
-          <w:u w:val="none"/>
         </w:rPr>
         <w:t>May 2025</w:t>
       </w:r>
@@ -712,14 +652,13 @@
           <w:b w:val="0"/>
           <w:i w:val="0"/>
           <w:sz w:val="19"/>
-          <w:u w:val="none"/>
         </w:rPr>
         <w:t>A Python tool that overlays realistic fake GPS geotags onto photos, using ImageDraw for rendering and the Mapbox API for real-world map data.</w:t>
       </w:r>
     </w:p>
     <w:p>
       <w:pPr>
-        <w:spacing w:before="20" w:after="60"/>
+        <w:spacing w:before="20" w:after="40"/>
       </w:pPr>
       <w:r>
         <w:rPr>
@@ -727,16 +666,12 @@
           <w:i w:val="0"/>
           <w:color w:val="1A56DB"/>
           <w:sz w:val="18"/>
-          <w:u w:val="none"/>
         </w:rPr>
         <w:t>github.com/aliasgarsogiawala/FakeGeotag</w:t>
       </w:r>
     </w:p>
     <w:p>
       <w:pPr>
-        <w:tabs>
-          <w:tab w:pos="8640" w:val="right"/>
-        </w:tabs>
         <w:spacing w:before="100" w:after="20"/>
         <w:tabs>
           <w:tab w:val="right" w:pos="8640"/>
@@ -747,7 +682,6 @@
           <w:b/>
           <w:i w:val="0"/>
           <w:sz w:val="20"/>
-          <w:u w:val="none"/>
         </w:rPr>
         <w:t>DomainFlip</w:t>
       </w:r>
@@ -757,7 +691,6 @@
           <w:i w:val="0"/>
           <w:color w:val="444444"/>
           <w:sz w:val="20"/>
-          <w:u w:val="none"/>
         </w:rPr>
         <w:t xml:space="preserve">  ·  </w:t>
       </w:r>
@@ -767,7 +700,6 @@
           <w:i/>
           <w:color w:val="444444"/>
           <w:sz w:val="20"/>
-          <w:u w:val="none"/>
         </w:rPr>
         <w:t>Solo Developer</w:t>
       </w:r>
@@ -779,7 +711,6 @@
           <w:b/>
           <w:i/>
           <w:sz w:val="19"/>
-          <w:u w:val="none"/>
         </w:rPr>
         <w:t>March 2025</w:t>
       </w:r>
@@ -795,7 +726,6 @@
           <w:b w:val="0"/>
           <w:i w:val="0"/>
           <w:sz w:val="19"/>
-          <w:u w:val="none"/>
         </w:rPr>
         <w:t xml:space="preserve">Domain-valuation and market-intelligence platform that scores names with rule-based and </w:t>
       </w:r>
@@ -805,7 +735,6 @@
           <w:i w:val="0"/>
           <w:color w:val="0E7490"/>
           <w:sz w:val="19"/>
-          <w:u w:val="none"/>
         </w:rPr>
         <w:t>Random Forest ML</w:t>
       </w:r>
@@ -814,14 +743,13 @@
           <w:b w:val="0"/>
           <w:i w:val="0"/>
           <w:sz w:val="19"/>
-          <w:u w:val="none"/>
         </w:rPr>
         <w:t xml:space="preserve"> models, detects resale listings, and tracks availability, using Next.js, Python, and the Gemini API.</w:t>
       </w:r>
     </w:p>
     <w:p>
       <w:pPr>
-        <w:spacing w:before="20" w:after="60"/>
+        <w:spacing w:before="20" w:after="40"/>
       </w:pPr>
       <w:r>
         <w:rPr>
@@ -829,16 +757,12 @@
           <w:i w:val="0"/>
           <w:color w:val="1A56DB"/>
           <w:sz w:val="18"/>
-          <w:u w:val="none"/>
         </w:rPr>
         <w:t>domain-flipping.vercel.app</w:t>
       </w:r>
     </w:p>
     <w:p>
       <w:pPr>
-        <w:tabs>
-          <w:tab w:pos="8640" w:val="right"/>
-        </w:tabs>
         <w:spacing w:before="100" w:after="20"/>
         <w:tabs>
           <w:tab w:val="right" w:pos="8640"/>
@@ -849,7 +773,6 @@
           <w:b/>
           <w:i w:val="0"/>
           <w:sz w:val="20"/>
-          <w:u w:val="none"/>
         </w:rPr>
         <w:t>TourSafe</w:t>
       </w:r>
@@ -859,7 +782,6 @@
           <w:i w:val="0"/>
           <w:color w:val="444444"/>
           <w:sz w:val="20"/>
-          <w:u w:val="none"/>
         </w:rPr>
         <w:t xml:space="preserve">  ·  </w:t>
       </w:r>
@@ -869,7 +791,6 @@
           <w:i/>
           <w:color w:val="444444"/>
           <w:sz w:val="20"/>
-          <w:u w:val="none"/>
         </w:rPr>
         <w:t>Solo Developer</w:t>
       </w:r>
@@ -881,7 +802,6 @@
           <w:b/>
           <w:i/>
           <w:sz w:val="19"/>
-          <w:u w:val="none"/>
         </w:rPr>
         <w:t>September 2024</w:t>
       </w:r>
@@ -897,14 +817,13 @@
           <w:b w:val="0"/>
           <w:i w:val="0"/>
           <w:sz w:val="19"/>
-          <w:u w:val="none"/>
         </w:rPr>
         <w:t>Platform to help tourists avoid scams, featuring a cab-fare estimator, an emergency SOS button, and a live chatroom, using Next.js, TypeScript, Neon, and Clerk.</w:t>
       </w:r>
     </w:p>
     <w:p>
       <w:pPr>
-        <w:spacing w:before="20" w:after="60"/>
+        <w:spacing w:before="20" w:after="40"/>
       </w:pPr>
       <w:r>
         <w:rPr>
@@ -912,7 +831,6 @@
           <w:i w:val="0"/>
           <w:color w:val="1A56DB"/>
           <w:sz w:val="18"/>
-          <w:u w:val="none"/>
         </w:rPr>
         <w:t>toursafe.in</w:t>
       </w:r>
@@ -930,16 +848,12 @@
           <w:i w:val="0"/>
           <w:caps/>
           <w:sz w:val="19"/>
-          <w:u w:val="none"/>
         </w:rPr>
         <w:t>Publications</w:t>
       </w:r>
     </w:p>
     <w:p>
       <w:pPr>
-        <w:tabs>
-          <w:tab w:pos="8640" w:val="right"/>
-        </w:tabs>
         <w:spacing w:before="100" w:after="20"/>
         <w:tabs>
           <w:tab w:val="right" w:pos="8640"/>
@@ -950,7 +864,6 @@
           <w:b/>
           <w:i w:val="0"/>
           <w:sz w:val="20"/>
-          <w:u w:val="none"/>
         </w:rPr>
         <w:t xml:space="preserve">Reinforcement Learning in </w:t>
       </w:r>
@@ -960,7 +873,6 @@
           <w:i w:val="0"/>
           <w:color w:val="0E7490"/>
           <w:sz w:val="20"/>
-          <w:u w:val="none"/>
         </w:rPr>
         <w:t>Predictive Analytics</w:t>
       </w:r>
@@ -969,17 +881,10 @@
           <w:b/>
           <w:i w:val="0"/>
           <w:sz w:val="20"/>
-          <w:u w:val="none"/>
         </w:rPr>
         <w:t xml:space="preserve"> for Human Behaviour</w:t>
       </w:r>
       <w:r>
-        <w:rPr>
-          <w:b w:val="0"/>
-          <w:i w:val="0"/>
-          <w:sz w:val="20"/>
-          <w:u w:val="none"/>
-        </w:rPr>
         <w:tab/>
       </w:r>
       <w:r>
@@ -987,7 +892,6 @@
           <w:b/>
           <w:i w:val="0"/>
           <w:sz w:val="19"/>
-          <w:u w:val="none"/>
         </w:rPr>
         <w:t>2025</w:t>
       </w:r>
@@ -1002,14 +906,13 @@
           <w:i/>
           <w:color w:val="444444"/>
           <w:sz w:val="19"/>
-          <w:u w:val="none"/>
         </w:rPr>
         <w:t>Sogiawala, A., Deshpande, R.  ·  International Journal of Advance and Innovative Research</w:t>
       </w:r>
     </w:p>
     <w:p>
       <w:pPr>
-        <w:spacing w:before="20" w:after="60"/>
+        <w:spacing w:before="20" w:after="40"/>
       </w:pPr>
       <w:r>
         <w:rPr>
@@ -1017,7 +920,6 @@
           <w:i w:val="0"/>
           <w:color w:val="1A56DB"/>
           <w:sz w:val="18"/>
-          <w:u w:val="none"/>
         </w:rPr>
         <w:t>doi.org/10.5281/zenodo.15681675</w:t>
       </w:r>
@@ -1035,16 +937,12 @@
           <w:i w:val="0"/>
           <w:caps/>
           <w:sz w:val="19"/>
-          <w:u w:val="none"/>
         </w:rPr>
         <w:t>Activities and Leadership</w:t>
       </w:r>
     </w:p>
     <w:p>
       <w:pPr>
-        <w:tabs>
-          <w:tab w:pos="8640" w:val="right"/>
-        </w:tabs>
         <w:spacing w:before="100" w:after="20"/>
         <w:tabs>
           <w:tab w:val="right" w:pos="8640"/>
@@ -1055,7 +953,6 @@
           <w:b/>
           <w:i w:val="0"/>
           <w:sz w:val="20"/>
-          <w:u w:val="none"/>
         </w:rPr>
         <w:t>Co-Founder, Tech Horizons Club</w:t>
       </w:r>
@@ -1067,7 +964,6 @@
           <w:b/>
           <w:i/>
           <w:sz w:val="19"/>
-          <w:u w:val="none"/>
         </w:rPr>
         <w:t>Nov 2024 – Present</w:t>
       </w:r>
@@ -1082,7 +978,6 @@
           <w:i/>
           <w:color w:val="444444"/>
           <w:sz w:val="19"/>
-          <w:u w:val="none"/>
         </w:rPr>
         <w:t>Co-Founder &amp; Web Developer</w:t>
       </w:r>
@@ -1098,16 +993,12 @@
           <w:b w:val="0"/>
           <w:i w:val="0"/>
           <w:sz w:val="19"/>
-          <w:u w:val="none"/>
         </w:rPr>
         <w:t>Co-founded a club for tech enthusiasts to learn and grow together; designed and built the club's website end-to-end with Next.js, TypeScript, and Tailwind CSS.</w:t>
       </w:r>
     </w:p>
     <w:p>
       <w:pPr>
-        <w:tabs>
-          <w:tab w:pos="8640" w:val="right"/>
-        </w:tabs>
         <w:spacing w:before="100" w:after="20"/>
         <w:tabs>
           <w:tab w:val="right" w:pos="8640"/>
@@ -1118,7 +1009,6 @@
           <w:b/>
           <w:i w:val="0"/>
           <w:sz w:val="20"/>
-          <w:u w:val="none"/>
         </w:rPr>
         <w:t>Hackathon Head, Dot Com Club</w:t>
       </w:r>
@@ -1130,7 +1020,6 @@
           <w:b/>
           <w:i/>
           <w:sz w:val="19"/>
-          <w:u w:val="none"/>
         </w:rPr>
         <w:t>May 2025 – Present</w:t>
       </w:r>
@@ -1145,7 +1034,6 @@
           <w:i/>
           <w:color w:val="444444"/>
           <w:sz w:val="19"/>
-          <w:u w:val="none"/>
         </w:rPr>
         <w:t>Hackathon Head</w:t>
       </w:r>
@@ -1161,16 +1049,12 @@
           <w:b w:val="0"/>
           <w:i w:val="0"/>
           <w:sz w:val="19"/>
-          <w:u w:val="none"/>
         </w:rPr>
         <w:t>Lead hackathon planning and execution, overseeing problem statements, event design, participant experience, and judging for college-wide technical competitions.</w:t>
       </w:r>
     </w:p>
     <w:p>
       <w:pPr>
-        <w:tabs>
-          <w:tab w:pos="8640" w:val="right"/>
-        </w:tabs>
         <w:spacing w:before="100" w:after="20"/>
         <w:tabs>
           <w:tab w:val="right" w:pos="8640"/>
@@ -1181,7 +1065,6 @@
           <w:b/>
           <w:i w:val="0"/>
           <w:sz w:val="20"/>
-          <w:u w:val="none"/>
         </w:rPr>
         <w:t>Sponsorship Head, Dot Com Club</w:t>
       </w:r>
@@ -1193,7 +1076,6 @@
           <w:b/>
           <w:i/>
           <w:sz w:val="19"/>
-          <w:u w:val="none"/>
         </w:rPr>
         <w:t>May 2025 – Present</w:t>
       </w:r>
@@ -1208,7 +1090,6 @@
           <w:i/>
           <w:color w:val="444444"/>
           <w:sz w:val="19"/>
-          <w:u w:val="none"/>
         </w:rPr>
         <w:t>Leader of the Sponsorship Team</w:t>
       </w:r>
@@ -1224,16 +1105,12 @@
           <w:b w:val="0"/>
           <w:i w:val="0"/>
           <w:sz w:val="19"/>
-          <w:u w:val="none"/>
         </w:rPr>
         <w:t>Leading the sponsorship team, securing partnerships and funding to support the club's tech events and initiatives.</w:t>
       </w:r>
     </w:p>
     <w:p>
       <w:pPr>
-        <w:tabs>
-          <w:tab w:pos="8640" w:val="right"/>
-        </w:tabs>
         <w:spacing w:before="100" w:after="20"/>
         <w:tabs>
           <w:tab w:val="right" w:pos="8640"/>
@@ -1244,7 +1121,6 @@
           <w:b/>
           <w:i w:val="0"/>
           <w:sz w:val="20"/>
-          <w:u w:val="none"/>
         </w:rPr>
         <w:t>Internship, Zillionite</w:t>
       </w:r>
@@ -1256,7 +1132,6 @@
           <w:b/>
           <w:i/>
           <w:sz w:val="19"/>
-          <w:u w:val="none"/>
         </w:rPr>
         <w:t>Feb 2025 – Apr 2025</w:t>
       </w:r>
@@ -1271,7 +1146,6 @@
           <w:i/>
           <w:color w:val="444444"/>
           <w:sz w:val="19"/>
-          <w:u w:val="none"/>
         </w:rPr>
         <w:t>Web Development Intern</w:t>
       </w:r>
@@ -1287,7 +1161,6 @@
           <w:b w:val="0"/>
           <w:i w:val="0"/>
           <w:sz w:val="19"/>
-          <w:u w:val="none"/>
         </w:rPr>
         <w:t>Developed the entire Zillionite website end-to-end (frontend and backend) using Next.js, Tailwind CSS, and MongoDB for user data and purchases, with Razorpay for payment integration.</w:t>
       </w:r>
@@ -1303,7 +1176,6 @@
           <w:b w:val="0"/>
           <w:i w:val="0"/>
           <w:sz w:val="19"/>
-          <w:u w:val="none"/>
         </w:rPr>
         <w:t xml:space="preserve">Built Python-based </w:t>
       </w:r>
@@ -1313,7 +1185,6 @@
           <w:i w:val="0"/>
           <w:color w:val="0E7490"/>
           <w:sz w:val="19"/>
-          <w:u w:val="none"/>
         </w:rPr>
         <w:t>financial models</w:t>
       </w:r>
@@ -1322,7 +1193,6 @@
           <w:b w:val="0"/>
           <w:i w:val="0"/>
           <w:sz w:val="19"/>
-          <w:u w:val="none"/>
         </w:rPr>
         <w:t xml:space="preserve"> to generate the platform's </w:t>
       </w:r>
@@ -1332,7 +1202,6 @@
           <w:i w:val="0"/>
           <w:color w:val="0E7490"/>
           <w:sz w:val="19"/>
-          <w:u w:val="none"/>
         </w:rPr>
         <w:t>P&amp;L statements and balance sheets</w:t>
       </w:r>
@@ -1341,16 +1210,12 @@
           <w:b w:val="0"/>
           <w:i w:val="0"/>
           <w:sz w:val="19"/>
-          <w:u w:val="none"/>
         </w:rPr>
         <w:t>, supporting its wealth-tracking and reporting features.</w:t>
       </w:r>
     </w:p>
     <w:p>
       <w:pPr>
-        <w:tabs>
-          <w:tab w:pos="8640" w:val="right"/>
-        </w:tabs>
         <w:spacing w:before="100" w:after="20"/>
         <w:tabs>
           <w:tab w:val="right" w:pos="8640"/>
@@ -1361,7 +1226,6 @@
           <w:b/>
           <w:i w:val="0"/>
           <w:sz w:val="20"/>
-          <w:u w:val="none"/>
         </w:rPr>
         <w:t>External Public Relations, The Social and Dramatic Union (SDU)</w:t>
       </w:r>
@@ -1373,7 +1237,6 @@
           <w:b/>
           <w:i/>
           <w:sz w:val="19"/>
-          <w:u w:val="none"/>
         </w:rPr>
         <w:t>Jun 2023 – Mar 2024</w:t>
       </w:r>
@@ -1388,7 +1251,6 @@
           <w:i/>
           <w:color w:val="444444"/>
           <w:sz w:val="19"/>
-          <w:u w:val="none"/>
         </w:rPr>
         <w:t>External PR Team</w:t>
       </w:r>
@@ -1404,16 +1266,12 @@
           <w:b w:val="0"/>
           <w:i w:val="0"/>
           <w:sz w:val="19"/>
-          <w:u w:val="none"/>
         </w:rPr>
         <w:t>Managed external communications and PR for one of Mumbai's most prestigious drama societies; coordinated outreach, press coverage, and audience engagement across multiple productions.</w:t>
       </w:r>
     </w:p>
     <w:p>
       <w:pPr>
-        <w:tabs>
-          <w:tab w:pos="8640" w:val="right"/>
-        </w:tabs>
         <w:spacing w:before="100" w:after="20"/>
         <w:tabs>
           <w:tab w:val="right" w:pos="8640"/>
@@ -1424,7 +1282,6 @@
           <w:b/>
           <w:i w:val="0"/>
           <w:sz w:val="20"/>
-          <w:u w:val="none"/>
         </w:rPr>
         <w:t>Internship, Overtures Infotech</w:t>
       </w:r>
@@ -1436,7 +1293,6 @@
           <w:b/>
           <w:i/>
           <w:sz w:val="19"/>
-          <w:u w:val="none"/>
         </w:rPr>
         <w:t>May 2023 – Jul 2023</w:t>
       </w:r>
@@ -1451,7 +1307,6 @@
           <w:i/>
           <w:color w:val="444444"/>
           <w:sz w:val="19"/>
-          <w:u w:val="none"/>
         </w:rPr>
         <w:t>Web Development Intern</w:t>
       </w:r>
@@ -1467,7 +1322,6 @@
           <w:b w:val="0"/>
           <w:i w:val="0"/>
           <w:sz w:val="19"/>
-          <w:u w:val="none"/>
         </w:rPr>
         <w:t>Developed and maintained client websites using ASP-based front-end and back-end technologies.</w:t>
       </w:r>
@@ -1483,7 +1337,6 @@
           <w:b w:val="0"/>
           <w:i w:val="0"/>
           <w:sz w:val="19"/>
-          <w:u w:val="none"/>
         </w:rPr>
         <w:t xml:space="preserve">Implemented on-page </w:t>
       </w:r>
@@ -1493,7 +1346,6 @@
           <w:i w:val="0"/>
           <w:color w:val="0E7490"/>
           <w:sz w:val="19"/>
-          <w:u w:val="none"/>
         </w:rPr>
         <w:t>SEO</w:t>
       </w:r>
@@ -1502,7 +1354,6 @@
           <w:b w:val="0"/>
           <w:i w:val="0"/>
           <w:sz w:val="19"/>
-          <w:u w:val="none"/>
         </w:rPr>
         <w:t xml:space="preserve"> strategies, conducted keyword research, and used </w:t>
       </w:r>
@@ -1512,7 +1363,6 @@
           <w:i w:val="0"/>
           <w:color w:val="0E7490"/>
           <w:sz w:val="19"/>
-          <w:u w:val="none"/>
         </w:rPr>
         <w:t>web analytics</w:t>
       </w:r>
@@ -1521,7 +1371,6 @@
           <w:b w:val="0"/>
           <w:i w:val="0"/>
           <w:sz w:val="19"/>
-          <w:u w:val="none"/>
         </w:rPr>
         <w:t xml:space="preserve"> to improve organic search rankings.</w:t>
       </w:r>
@@ -1539,7 +1388,6 @@
           <w:i w:val="0"/>
           <w:caps/>
           <w:sz w:val="19"/>
-          <w:u w:val="none"/>
         </w:rPr>
         <w:t>Skills</w:t>
       </w:r>
@@ -1553,7 +1401,6 @@
           <w:b/>
           <w:i w:val="0"/>
           <w:sz w:val="19"/>
-          <w:u w:val="none"/>
         </w:rPr>
         <w:t xml:space="preserve">Languages: </w:t>
       </w:r>
@@ -1562,7 +1409,6 @@
           <w:b w:val="0"/>
           <w:i w:val="0"/>
           <w:sz w:val="19"/>
-          <w:u w:val="none"/>
         </w:rPr>
         <w:t>Python, JavaScript, TypeScript, Java, C++, C, SQL, HTML/CSS</w:t>
       </w:r>
@@ -1576,7 +1422,6 @@
           <w:b/>
           <w:i w:val="0"/>
           <w:sz w:val="19"/>
-          <w:u w:val="none"/>
         </w:rPr>
         <w:t xml:space="preserve">Frameworks &amp; Libraries: </w:t>
       </w:r>
@@ -1585,7 +1430,6 @@
           <w:b w:val="0"/>
           <w:i w:val="0"/>
           <w:sz w:val="19"/>
-          <w:u w:val="none"/>
         </w:rPr>
         <w:t>React.js, Next.js, React Native, Node.js, Tailwind CSS, Flutter, Three.js, GSAP</w:t>
       </w:r>
@@ -1599,7 +1443,6 @@
           <w:b/>
           <w:i w:val="0"/>
           <w:sz w:val="19"/>
-          <w:u w:val="none"/>
         </w:rPr>
         <w:t xml:space="preserve">AI / ML &amp; Data: </w:t>
       </w:r>
@@ -1608,7 +1451,6 @@
           <w:b w:val="0"/>
           <w:i w:val="0"/>
           <w:sz w:val="19"/>
-          <w:u w:val="none"/>
         </w:rPr>
         <w:t xml:space="preserve">OpenAI API, Gemini API, PyTorch, TensorFlow, </w:t>
       </w:r>
@@ -1618,7 +1460,6 @@
           <w:i w:val="0"/>
           <w:color w:val="0E7490"/>
           <w:sz w:val="19"/>
-          <w:u w:val="none"/>
         </w:rPr>
         <w:t>Random Forest, Power BI, DAX</w:t>
       </w:r>
@@ -1627,7 +1468,6 @@
           <w:b w:val="0"/>
           <w:i w:val="0"/>
           <w:sz w:val="19"/>
-          <w:u w:val="none"/>
         </w:rPr>
         <w:t>, REST APIs</w:t>
       </w:r>
@@ -1641,7 +1481,36 @@
           <w:b/>
           <w:i w:val="0"/>
           <w:sz w:val="19"/>
-          <w:u w:val="none"/>
+        </w:rPr>
+        <w:t xml:space="preserve">Cloud &amp; Infrastructure: </w:t>
+      </w:r>
+      <w:r>
+        <w:rPr>
+          <w:b/>
+          <w:i w:val="0"/>
+          <w:color w:val="0E7490"/>
+          <w:sz w:val="19"/>
+        </w:rPr>
+        <w:t>AWS, Azure</w:t>
+      </w:r>
+      <w:r>
+        <w:rPr>
+          <w:b w:val="0"/>
+          <w:i w:val="0"/>
+          <w:sz w:val="19"/>
+        </w:rPr>
+        <w:t>, Vercel, Railway, Render, Firebase, Cloudflare</w:t>
+      </w:r>
+    </w:p>
+    <w:p>
+      <w:pPr>
+        <w:spacing w:before="0" w:after="20"/>
+      </w:pPr>
+      <w:r>
+        <w:rPr>
+          <w:b/>
+          <w:i w:val="0"/>
+          <w:sz w:val="19"/>
         </w:rPr>
         <w:t xml:space="preserve">Databases &amp; Backend: </w:t>
       </w:r>
@@ -1650,7 +1519,6 @@
           <w:b w:val="0"/>
           <w:i w:val="0"/>
           <w:sz w:val="19"/>
-          <w:u w:val="none"/>
         </w:rPr>
         <w:t>MongoDB, PostgreSQL (Neon), Convex, Supabase, Clerk, SuperTokens, Razorpay</w:t>
       </w:r>
@@ -1664,7 +1532,6 @@
           <w:b/>
           <w:i w:val="0"/>
           <w:sz w:val="19"/>
-          <w:u w:val="none"/>
         </w:rPr>
         <w:t xml:space="preserve">Tools &amp; Platforms: </w:t>
       </w:r>
@@ -1673,9 +1540,8 @@
           <w:b w:val="0"/>
           <w:i w:val="0"/>
           <w:sz w:val="19"/>
-          <w:u w:val="none"/>
         </w:rPr>
-        <w:t>Git, GitHub, GitHub Copilot, VS Code, Vercel, Railway, Render, npm, Jupyter Notebook</w:t>
+        <w:t>Git, GitHub, GitHub Copilot, VS Code, npm, Jupyter Notebook, Docker</w:t>
       </w:r>
     </w:p>
     <w:sectPr>

</xml_diff>